<commit_message>
Actualización del informe técnico de mejoras en generación de reportes PDF
</commit_message>
<xml_diff>
--- a/tcg-admin/docs/Informe técnico de mejoras de robustez en generación de reportes PDF.docx
+++ b/tcg-admin/docs/Informe técnico de mejoras de robustez en generación de reportes PDF.docx
@@ -318,14 +318,12 @@
           <w:rFonts w:ascii="Arial" w:hAnsi="Arial" w:cs="Arial"/>
         </w:rPr>
       </w:pPr>
-      <w:proofErr w:type="spellStart"/>
       <w:r>
         <w:rPr>
           <w:rFonts w:ascii="Arial" w:hAnsi="Arial" w:cs="Arial"/>
         </w:rPr>
         <w:t>topStores</w:t>
       </w:r>
-      <w:proofErr w:type="spellEnd"/>
     </w:p>
     <w:p>
       <w:pPr>
@@ -339,14 +337,12 @@
           <w:rFonts w:ascii="Arial" w:hAnsi="Arial" w:cs="Arial"/>
         </w:rPr>
       </w:pPr>
-      <w:proofErr w:type="spellStart"/>
       <w:r>
         <w:rPr>
           <w:rFonts w:ascii="Arial" w:hAnsi="Arial" w:cs="Arial"/>
         </w:rPr>
         <w:t>topGames</w:t>
       </w:r>
-      <w:proofErr w:type="spellEnd"/>
     </w:p>
     <w:p>
       <w:pPr>
@@ -360,14 +356,12 @@
           <w:rFonts w:ascii="Arial" w:hAnsi="Arial" w:cs="Arial"/>
         </w:rPr>
       </w:pPr>
-      <w:proofErr w:type="spellStart"/>
       <w:r>
         <w:rPr>
           <w:rFonts w:ascii="Arial" w:hAnsi="Arial" w:cs="Arial"/>
         </w:rPr>
         <w:t>topActivities</w:t>
       </w:r>
-      <w:proofErr w:type="spellEnd"/>
     </w:p>
     <w:p>
       <w:pPr>
@@ -381,14 +375,12 @@
           <w:rFonts w:ascii="Arial" w:hAnsi="Arial" w:cs="Arial"/>
         </w:rPr>
       </w:pPr>
-      <w:proofErr w:type="spellStart"/>
       <w:r>
         <w:rPr>
           <w:rFonts w:ascii="Arial" w:hAnsi="Arial" w:cs="Arial"/>
         </w:rPr>
         <w:t>gameCategoryParticipation</w:t>
       </w:r>
-      <w:proofErr w:type="spellEnd"/>
     </w:p>
     <w:p>
       <w:pPr>
@@ -435,48 +427,26 @@
           <w:rFonts w:ascii="Arial" w:hAnsi="Arial" w:cs="Arial"/>
         </w:rPr>
       </w:pPr>
-      <w:proofErr w:type="spellStart"/>
-      <w:r>
-        <w:rPr>
-          <w:rFonts w:ascii="Arial" w:hAnsi="Arial" w:cs="Arial"/>
-        </w:rPr>
-        <w:t>data.topStores.map</w:t>
-      </w:r>
-      <w:proofErr w:type="spellEnd"/>
-      <w:r>
-        <w:rPr>
-          <w:rFonts w:ascii="Arial" w:hAnsi="Arial" w:cs="Arial"/>
-        </w:rPr>
-        <w:t>(...)</w:t>
-      </w:r>
-    </w:p>
-    <w:p>
-      <w:pPr>
-        <w:spacing w:after="0"/>
-        <w:jc w:val="both"/>
-        <w:rPr>
-          <w:rFonts w:ascii="Arial" w:hAnsi="Arial" w:cs="Arial"/>
-        </w:rPr>
-      </w:pPr>
-      <w:r>
-        <w:rPr>
-          <w:rFonts w:ascii="Arial" w:hAnsi="Arial" w:cs="Arial"/>
-        </w:rPr>
-        <w:t xml:space="preserve">El problema es que, si por alguna razón el servicio de analítica devuelve un valor undefined, </w:t>
-      </w:r>
-      <w:proofErr w:type="spellStart"/>
-      <w:r>
-        <w:rPr>
-          <w:rFonts w:ascii="Arial" w:hAnsi="Arial" w:cs="Arial"/>
-        </w:rPr>
-        <w:t>null</w:t>
-      </w:r>
-      <w:proofErr w:type="spellEnd"/>
-      <w:r>
-        <w:rPr>
-          <w:rFonts w:ascii="Arial" w:hAnsi="Arial" w:cs="Arial"/>
-        </w:rPr>
-        <w:t xml:space="preserve"> o una colección vacía, el método </w:t>
+      <w:r>
+        <w:rPr>
+          <w:rFonts w:ascii="Arial" w:hAnsi="Arial" w:cs="Arial"/>
+        </w:rPr>
+        <w:t>data.topStores.map(...)</w:t>
+      </w:r>
+    </w:p>
+    <w:p>
+      <w:pPr>
+        <w:spacing w:after="0"/>
+        <w:jc w:val="both"/>
+        <w:rPr>
+          <w:rFonts w:ascii="Arial" w:hAnsi="Arial" w:cs="Arial"/>
+        </w:rPr>
+      </w:pPr>
+      <w:r>
+        <w:rPr>
+          <w:rFonts w:ascii="Arial" w:hAnsi="Arial" w:cs="Arial"/>
+        </w:rPr>
+        <w:t xml:space="preserve">El problema es que, si por alguna razón el servicio de analítica devuelve un valor undefined, null o una colección vacía, el método </w:t>
       </w:r>
       <w:proofErr w:type="spellStart"/>
       <w:r>
@@ -667,19 +637,11 @@
           <w:rFonts w:ascii="Arial" w:hAnsi="Arial" w:cs="Arial"/>
         </w:rPr>
       </w:pPr>
-      <w:proofErr w:type="spellStart"/>
-      <w:r>
-        <w:rPr>
-          <w:rFonts w:ascii="Arial" w:hAnsi="Arial" w:cs="Arial"/>
-        </w:rPr>
-        <w:t>data.topStores.map</w:t>
-      </w:r>
-      <w:proofErr w:type="spellEnd"/>
-      <w:r>
-        <w:rPr>
-          <w:rFonts w:ascii="Arial" w:hAnsi="Arial" w:cs="Arial"/>
-        </w:rPr>
-        <w:t>((store, index) =&gt; ...)</w:t>
+      <w:r>
+        <w:rPr>
+          <w:rFonts w:ascii="Arial" w:hAnsi="Arial" w:cs="Arial"/>
+        </w:rPr>
+        <w:t>data.topStores.map((store, index) =&gt; ...)</w:t>
       </w:r>
     </w:p>
     <w:p>
@@ -767,21 +729,7 @@
         <w:rPr>
           <w:rFonts w:ascii="Arial" w:hAnsi="Arial" w:cs="Arial"/>
         </w:rPr>
-        <w:t xml:space="preserve">Si </w:t>
-      </w:r>
-      <w:proofErr w:type="spellStart"/>
-      <w:r>
-        <w:rPr>
-          <w:rFonts w:ascii="Arial" w:hAnsi="Arial" w:cs="Arial"/>
-        </w:rPr>
-        <w:t>topStores</w:t>
-      </w:r>
-      <w:proofErr w:type="spellEnd"/>
-      <w:r>
-        <w:rPr>
-          <w:rFonts w:ascii="Arial" w:hAnsi="Arial" w:cs="Arial"/>
-        </w:rPr>
-        <w:t xml:space="preserve"> contiene datos, el sistema funciona normalmente.</w:t>
+        <w:t>Si topStores contiene datos, el sistema funciona normalmente.</w:t>
       </w:r>
     </w:p>
     <w:p>
@@ -799,35 +747,7 @@
         <w:rPr>
           <w:rFonts w:ascii="Arial" w:hAnsi="Arial" w:cs="Arial"/>
         </w:rPr>
-        <w:t xml:space="preserve">Si </w:t>
-      </w:r>
-      <w:proofErr w:type="spellStart"/>
-      <w:r>
-        <w:rPr>
-          <w:rFonts w:ascii="Arial" w:hAnsi="Arial" w:cs="Arial"/>
-        </w:rPr>
-        <w:t>topStores</w:t>
-      </w:r>
-      <w:proofErr w:type="spellEnd"/>
-      <w:r>
-        <w:rPr>
-          <w:rFonts w:ascii="Arial" w:hAnsi="Arial" w:cs="Arial"/>
-        </w:rPr>
-        <w:t xml:space="preserve"> es undefined o </w:t>
-      </w:r>
-      <w:proofErr w:type="spellStart"/>
-      <w:r>
-        <w:rPr>
-          <w:rFonts w:ascii="Arial" w:hAnsi="Arial" w:cs="Arial"/>
-        </w:rPr>
-        <w:t>null</w:t>
-      </w:r>
-      <w:proofErr w:type="spellEnd"/>
-      <w:r>
-        <w:rPr>
-          <w:rFonts w:ascii="Arial" w:hAnsi="Arial" w:cs="Arial"/>
-        </w:rPr>
-        <w:t>, se utiliza un arreglo vacío.</w:t>
+        <w:t>Si topStores es undefined o null, se utiliza un arreglo vacío.</w:t>
       </w:r>
     </w:p>
     <w:p>
@@ -1582,6 +1502,7 @@
     </w:p>
     <w:p>
       <w:pPr>
+        <w:spacing w:after="0"/>
         <w:jc w:val="both"/>
         <w:rPr>
           <w:rFonts w:ascii="Arial" w:hAnsi="Arial" w:cs="Arial"/>
@@ -1596,35 +1517,1013 @@
     </w:p>
     <w:p>
       <w:pPr>
-        <w:jc w:val="both"/>
-        <w:rPr>
-          <w:rFonts w:ascii="Arial" w:hAnsi="Arial" w:cs="Arial"/>
-        </w:rPr>
-      </w:pPr>
-    </w:p>
-    <w:p>
-      <w:pPr>
-        <w:jc w:val="both"/>
-        <w:rPr>
-          <w:rFonts w:ascii="Arial" w:hAnsi="Arial" w:cs="Arial"/>
-        </w:rPr>
-      </w:pPr>
-    </w:p>
-    <w:p>
-      <w:pPr>
-        <w:jc w:val="both"/>
-        <w:rPr>
-          <w:rFonts w:ascii="Arial" w:hAnsi="Arial" w:cs="Arial"/>
-        </w:rPr>
-      </w:pPr>
-    </w:p>
-    <w:p>
-      <w:pPr>
-        <w:jc w:val="both"/>
-        <w:rPr>
-          <w:rFonts w:ascii="Arial" w:hAnsi="Arial" w:cs="Arial"/>
-        </w:rPr>
-      </w:pPr>
+        <w:spacing w:after="0"/>
+        <w:jc w:val="both"/>
+        <w:rPr>
+          <w:rFonts w:ascii="Arial" w:hAnsi="Arial" w:cs="Arial"/>
+        </w:rPr>
+      </w:pPr>
+    </w:p>
+    <w:p>
+      <w:pPr>
+        <w:spacing w:after="0"/>
+        <w:jc w:val="both"/>
+        <w:rPr>
+          <w:rFonts w:ascii="Arial" w:hAnsi="Arial" w:cs="Arial"/>
+          <w:b/>
+          <w:bCs/>
+          <w:sz w:val="28"/>
+          <w:szCs w:val="28"/>
+        </w:rPr>
+      </w:pPr>
+      <w:r>
+        <w:rPr>
+          <w:rFonts w:ascii="Arial" w:hAnsi="Arial" w:cs="Arial"/>
+          <w:b/>
+          <w:bCs/>
+          <w:sz w:val="28"/>
+          <w:szCs w:val="28"/>
+        </w:rPr>
+        <w:t>Mejora 1</w:t>
+      </w:r>
+      <w:r>
+        <w:rPr>
+          <w:rFonts w:ascii="Arial" w:hAnsi="Arial" w:cs="Arial"/>
+          <w:b/>
+          <w:bCs/>
+          <w:sz w:val="28"/>
+          <w:szCs w:val="28"/>
+        </w:rPr>
+        <w:t xml:space="preserve"> antes y después </w:t>
+      </w:r>
+      <w:r>
+        <w:rPr>
+          <w:rFonts w:ascii="Arial" w:hAnsi="Arial" w:cs="Arial"/>
+          <w:b/>
+          <w:bCs/>
+          <w:sz w:val="28"/>
+          <w:szCs w:val="28"/>
+        </w:rPr>
+        <w:t>corregido</w:t>
+      </w:r>
+    </w:p>
+    <w:p>
+      <w:pPr>
+        <w:spacing w:after="0"/>
+        <w:jc w:val="both"/>
+        <w:rPr>
+          <w:rFonts w:ascii="Arial" w:hAnsi="Arial" w:cs="Arial"/>
+          <w:sz w:val="16"/>
+          <w:szCs w:val="16"/>
+        </w:rPr>
+      </w:pPr>
+    </w:p>
+    <w:p>
+      <w:pPr>
+        <w:spacing w:after="0"/>
+        <w:jc w:val="both"/>
+        <w:rPr>
+          <w:rFonts w:ascii="Arial" w:hAnsi="Arial" w:cs="Arial"/>
+        </w:rPr>
+      </w:pPr>
+      <w:r>
+        <w:rPr>
+          <w:rFonts w:ascii="Arial" w:hAnsi="Arial" w:cs="Arial"/>
+          <w:noProof/>
+        </w:rPr>
+        <w:drawing>
+          <wp:inline distT="0" distB="0" distL="0" distR="0" wp14:anchorId="49F63BF1" wp14:editId="64E9A457">
+            <wp:extent cx="5612130" cy="1554480"/>
+            <wp:effectExtent l="0" t="0" r="7620" b="7620"/>
+            <wp:docPr id="282740448" name="Imagen 1"/>
+            <wp:cNvGraphicFramePr>
+              <a:graphicFrameLocks xmlns:a="http://schemas.openxmlformats.org/drawingml/2006/main" noChangeAspect="1"/>
+            </wp:cNvGraphicFramePr>
+            <a:graphic xmlns:a="http://schemas.openxmlformats.org/drawingml/2006/main">
+              <a:graphicData uri="http://schemas.openxmlformats.org/drawingml/2006/picture">
+                <pic:pic xmlns:pic="http://schemas.openxmlformats.org/drawingml/2006/picture">
+                  <pic:nvPicPr>
+                    <pic:cNvPr id="282740448" name="Imagen 282740448"/>
+                    <pic:cNvPicPr/>
+                  </pic:nvPicPr>
+                  <pic:blipFill rotWithShape="1">
+                    <a:blip r:embed="rId5">
+                      <a:extLst>
+                        <a:ext uri="{28A0092B-C50C-407E-A947-70E740481C1C}">
+                          <a14:useLocalDpi xmlns:a14="http://schemas.microsoft.com/office/drawing/2010/main" val="0"/>
+                        </a:ext>
+                      </a:extLst>
+                    </a:blip>
+                    <a:srcRect b="31429"/>
+                    <a:stretch>
+                      <a:fillRect/>
+                    </a:stretch>
+                  </pic:blipFill>
+                  <pic:spPr bwMode="auto">
+                    <a:xfrm>
+                      <a:off x="0" y="0"/>
+                      <a:ext cx="5612130" cy="1554480"/>
+                    </a:xfrm>
+                    <a:prstGeom prst="rect">
+                      <a:avLst/>
+                    </a:prstGeom>
+                    <a:ln>
+                      <a:noFill/>
+                    </a:ln>
+                    <a:extLst>
+                      <a:ext uri="{53640926-AAD7-44D8-BBD7-CCE9431645EC}">
+                        <a14:shadowObscured xmlns:a14="http://schemas.microsoft.com/office/drawing/2010/main"/>
+                      </a:ext>
+                    </a:extLst>
+                  </pic:spPr>
+                </pic:pic>
+              </a:graphicData>
+            </a:graphic>
+          </wp:inline>
+        </w:drawing>
+      </w:r>
+    </w:p>
+    <w:p>
+      <w:pPr>
+        <w:spacing w:after="0"/>
+        <w:jc w:val="both"/>
+        <w:rPr>
+          <w:rFonts w:ascii="Arial" w:hAnsi="Arial" w:cs="Arial"/>
+          <w:sz w:val="16"/>
+          <w:szCs w:val="16"/>
+        </w:rPr>
+      </w:pPr>
+    </w:p>
+    <w:p>
+      <w:pPr>
+        <w:spacing w:after="0"/>
+        <w:jc w:val="both"/>
+        <w:rPr>
+          <w:rFonts w:ascii="Arial" w:hAnsi="Arial" w:cs="Arial"/>
+        </w:rPr>
+      </w:pPr>
+      <w:r>
+        <w:rPr>
+          <w:rFonts w:ascii="Arial" w:hAnsi="Arial" w:cs="Arial"/>
+          <w:noProof/>
+        </w:rPr>
+        <w:drawing>
+          <wp:inline distT="0" distB="0" distL="0" distR="0" wp14:anchorId="26005934" wp14:editId="3E4AD340">
+            <wp:extent cx="5612130" cy="1455420"/>
+            <wp:effectExtent l="0" t="0" r="7620" b="0"/>
+            <wp:docPr id="1596631613" name="Imagen 2"/>
+            <wp:cNvGraphicFramePr>
+              <a:graphicFrameLocks xmlns:a="http://schemas.openxmlformats.org/drawingml/2006/main" noChangeAspect="1"/>
+            </wp:cNvGraphicFramePr>
+            <a:graphic xmlns:a="http://schemas.openxmlformats.org/drawingml/2006/main">
+              <a:graphicData uri="http://schemas.openxmlformats.org/drawingml/2006/picture">
+                <pic:pic xmlns:pic="http://schemas.openxmlformats.org/drawingml/2006/picture">
+                  <pic:nvPicPr>
+                    <pic:cNvPr id="1596631613" name="Imagen 1596631613"/>
+                    <pic:cNvPicPr/>
+                  </pic:nvPicPr>
+                  <pic:blipFill rotWithShape="1">
+                    <a:blip r:embed="rId6">
+                      <a:extLst>
+                        <a:ext uri="{28A0092B-C50C-407E-A947-70E740481C1C}">
+                          <a14:useLocalDpi xmlns:a14="http://schemas.microsoft.com/office/drawing/2010/main" val="0"/>
+                        </a:ext>
+                      </a:extLst>
+                    </a:blip>
+                    <a:srcRect b="47153"/>
+                    <a:stretch>
+                      <a:fillRect/>
+                    </a:stretch>
+                  </pic:blipFill>
+                  <pic:spPr bwMode="auto">
+                    <a:xfrm>
+                      <a:off x="0" y="0"/>
+                      <a:ext cx="5612130" cy="1455420"/>
+                    </a:xfrm>
+                    <a:prstGeom prst="rect">
+                      <a:avLst/>
+                    </a:prstGeom>
+                    <a:ln>
+                      <a:noFill/>
+                    </a:ln>
+                    <a:extLst>
+                      <a:ext uri="{53640926-AAD7-44D8-BBD7-CCE9431645EC}">
+                        <a14:shadowObscured xmlns:a14="http://schemas.microsoft.com/office/drawing/2010/main"/>
+                      </a:ext>
+                    </a:extLst>
+                  </pic:spPr>
+                </pic:pic>
+              </a:graphicData>
+            </a:graphic>
+          </wp:inline>
+        </w:drawing>
+      </w:r>
+    </w:p>
+    <w:p>
+      <w:pPr>
+        <w:spacing w:after="0"/>
+        <w:jc w:val="both"/>
+        <w:rPr>
+          <w:rFonts w:ascii="Arial" w:hAnsi="Arial" w:cs="Arial"/>
+          <w:b/>
+          <w:bCs/>
+          <w:sz w:val="28"/>
+          <w:szCs w:val="28"/>
+        </w:rPr>
+      </w:pPr>
+      <w:r>
+        <w:rPr>
+          <w:rFonts w:ascii="Arial" w:hAnsi="Arial" w:cs="Arial"/>
+          <w:b/>
+          <w:bCs/>
+          <w:sz w:val="28"/>
+          <w:szCs w:val="28"/>
+        </w:rPr>
+        <w:lastRenderedPageBreak/>
+        <w:t>Mejora 2</w:t>
+      </w:r>
+      <w:r>
+        <w:rPr>
+          <w:rFonts w:ascii="Arial" w:hAnsi="Arial" w:cs="Arial"/>
+          <w:b/>
+          <w:bCs/>
+          <w:sz w:val="28"/>
+          <w:szCs w:val="28"/>
+        </w:rPr>
+        <w:t xml:space="preserve"> antes y después corregido</w:t>
+      </w:r>
+    </w:p>
+    <w:p>
+      <w:pPr>
+        <w:spacing w:after="0"/>
+        <w:jc w:val="both"/>
+        <w:rPr>
+          <w:rFonts w:ascii="Arial" w:hAnsi="Arial" w:cs="Arial"/>
+          <w:sz w:val="16"/>
+          <w:szCs w:val="16"/>
+        </w:rPr>
+      </w:pPr>
+    </w:p>
+    <w:p>
+      <w:pPr>
+        <w:spacing w:after="0"/>
+        <w:jc w:val="both"/>
+        <w:rPr>
+          <w:rFonts w:ascii="Arial" w:hAnsi="Arial" w:cs="Arial"/>
+        </w:rPr>
+      </w:pPr>
+      <w:r>
+        <w:rPr>
+          <w:rFonts w:ascii="Arial" w:hAnsi="Arial" w:cs="Arial"/>
+          <w:noProof/>
+        </w:rPr>
+        <w:drawing>
+          <wp:inline distT="0" distB="0" distL="0" distR="0" wp14:anchorId="2FDAA327" wp14:editId="1525E93A">
+            <wp:extent cx="5612130" cy="1562100"/>
+            <wp:effectExtent l="0" t="0" r="7620" b="0"/>
+            <wp:docPr id="1572121097" name="Imagen 5"/>
+            <wp:cNvGraphicFramePr>
+              <a:graphicFrameLocks xmlns:a="http://schemas.openxmlformats.org/drawingml/2006/main" noChangeAspect="1"/>
+            </wp:cNvGraphicFramePr>
+            <a:graphic xmlns:a="http://schemas.openxmlformats.org/drawingml/2006/main">
+              <a:graphicData uri="http://schemas.openxmlformats.org/drawingml/2006/picture">
+                <pic:pic xmlns:pic="http://schemas.openxmlformats.org/drawingml/2006/picture">
+                  <pic:nvPicPr>
+                    <pic:cNvPr id="1572121097" name="Imagen 1572121097"/>
+                    <pic:cNvPicPr/>
+                  </pic:nvPicPr>
+                  <pic:blipFill rotWithShape="1">
+                    <a:blip r:embed="rId7">
+                      <a:extLst>
+                        <a:ext uri="{28A0092B-C50C-407E-A947-70E740481C1C}">
+                          <a14:useLocalDpi xmlns:a14="http://schemas.microsoft.com/office/drawing/2010/main" val="0"/>
+                        </a:ext>
+                      </a:extLst>
+                    </a:blip>
+                    <a:srcRect b="40450"/>
+                    <a:stretch>
+                      <a:fillRect/>
+                    </a:stretch>
+                  </pic:blipFill>
+                  <pic:spPr bwMode="auto">
+                    <a:xfrm>
+                      <a:off x="0" y="0"/>
+                      <a:ext cx="5612130" cy="1562100"/>
+                    </a:xfrm>
+                    <a:prstGeom prst="rect">
+                      <a:avLst/>
+                    </a:prstGeom>
+                    <a:ln>
+                      <a:noFill/>
+                    </a:ln>
+                    <a:extLst>
+                      <a:ext uri="{53640926-AAD7-44D8-BBD7-CCE9431645EC}">
+                        <a14:shadowObscured xmlns:a14="http://schemas.microsoft.com/office/drawing/2010/main"/>
+                      </a:ext>
+                    </a:extLst>
+                  </pic:spPr>
+                </pic:pic>
+              </a:graphicData>
+            </a:graphic>
+          </wp:inline>
+        </w:drawing>
+      </w:r>
+    </w:p>
+    <w:p>
+      <w:pPr>
+        <w:spacing w:after="0"/>
+        <w:jc w:val="both"/>
+        <w:rPr>
+          <w:rFonts w:ascii="Arial" w:hAnsi="Arial" w:cs="Arial"/>
+          <w:sz w:val="16"/>
+          <w:szCs w:val="16"/>
+        </w:rPr>
+      </w:pPr>
+    </w:p>
+    <w:p>
+      <w:pPr>
+        <w:jc w:val="both"/>
+        <w:rPr>
+          <w:rFonts w:ascii="Arial" w:hAnsi="Arial" w:cs="Arial"/>
+        </w:rPr>
+      </w:pPr>
+      <w:r>
+        <w:rPr>
+          <w:rFonts w:ascii="Arial" w:hAnsi="Arial" w:cs="Arial"/>
+          <w:noProof/>
+        </w:rPr>
+        <w:drawing>
+          <wp:inline distT="0" distB="0" distL="0" distR="0" wp14:anchorId="7C796B5D" wp14:editId="1E395E7F">
+            <wp:extent cx="5612130" cy="1470660"/>
+            <wp:effectExtent l="0" t="0" r="7620" b="0"/>
+            <wp:docPr id="350206007" name="Imagen 6"/>
+            <wp:cNvGraphicFramePr>
+              <a:graphicFrameLocks xmlns:a="http://schemas.openxmlformats.org/drawingml/2006/main" noChangeAspect="1"/>
+            </wp:cNvGraphicFramePr>
+            <a:graphic xmlns:a="http://schemas.openxmlformats.org/drawingml/2006/main">
+              <a:graphicData uri="http://schemas.openxmlformats.org/drawingml/2006/picture">
+                <pic:pic xmlns:pic="http://schemas.openxmlformats.org/drawingml/2006/picture">
+                  <pic:nvPicPr>
+                    <pic:cNvPr id="350206007" name="Imagen 350206007"/>
+                    <pic:cNvPicPr/>
+                  </pic:nvPicPr>
+                  <pic:blipFill rotWithShape="1">
+                    <a:blip r:embed="rId8">
+                      <a:extLst>
+                        <a:ext uri="{28A0092B-C50C-407E-A947-70E740481C1C}">
+                          <a14:useLocalDpi xmlns:a14="http://schemas.microsoft.com/office/drawing/2010/main" val="0"/>
+                        </a:ext>
+                      </a:extLst>
+                    </a:blip>
+                    <a:srcRect b="39435"/>
+                    <a:stretch>
+                      <a:fillRect/>
+                    </a:stretch>
+                  </pic:blipFill>
+                  <pic:spPr bwMode="auto">
+                    <a:xfrm>
+                      <a:off x="0" y="0"/>
+                      <a:ext cx="5612130" cy="1470660"/>
+                    </a:xfrm>
+                    <a:prstGeom prst="rect">
+                      <a:avLst/>
+                    </a:prstGeom>
+                    <a:ln>
+                      <a:noFill/>
+                    </a:ln>
+                    <a:extLst>
+                      <a:ext uri="{53640926-AAD7-44D8-BBD7-CCE9431645EC}">
+                        <a14:shadowObscured xmlns:a14="http://schemas.microsoft.com/office/drawing/2010/main"/>
+                      </a:ext>
+                    </a:extLst>
+                  </pic:spPr>
+                </pic:pic>
+              </a:graphicData>
+            </a:graphic>
+          </wp:inline>
+        </w:drawing>
+      </w:r>
+    </w:p>
+    <w:p>
+      <w:pPr>
+        <w:jc w:val="both"/>
+        <w:rPr>
+          <w:rFonts w:ascii="Arial" w:hAnsi="Arial" w:cs="Arial"/>
+        </w:rPr>
+      </w:pPr>
+    </w:p>
+    <w:p>
+      <w:pPr>
+        <w:spacing w:after="0"/>
+        <w:jc w:val="both"/>
+        <w:rPr>
+          <w:rFonts w:ascii="Arial" w:hAnsi="Arial" w:cs="Arial"/>
+          <w:b/>
+          <w:bCs/>
+          <w:sz w:val="28"/>
+          <w:szCs w:val="28"/>
+        </w:rPr>
+      </w:pPr>
+      <w:r>
+        <w:rPr>
+          <w:rFonts w:ascii="Arial" w:hAnsi="Arial" w:cs="Arial"/>
+          <w:b/>
+          <w:bCs/>
+          <w:sz w:val="28"/>
+          <w:szCs w:val="28"/>
+        </w:rPr>
+        <w:t>Mejora 3 antes y después corregido</w:t>
+      </w:r>
+    </w:p>
+    <w:p>
+      <w:pPr>
+        <w:spacing w:after="0"/>
+        <w:jc w:val="both"/>
+        <w:rPr>
+          <w:rFonts w:ascii="Arial" w:hAnsi="Arial" w:cs="Arial"/>
+          <w:sz w:val="16"/>
+          <w:szCs w:val="16"/>
+        </w:rPr>
+      </w:pPr>
+    </w:p>
+    <w:p>
+      <w:pPr>
+        <w:spacing w:after="0"/>
+        <w:jc w:val="both"/>
+        <w:rPr>
+          <w:rFonts w:ascii="Arial" w:hAnsi="Arial" w:cs="Arial"/>
+        </w:rPr>
+      </w:pPr>
+      <w:r>
+        <w:rPr>
+          <w:rFonts w:ascii="Arial" w:hAnsi="Arial" w:cs="Arial"/>
+          <w:noProof/>
+        </w:rPr>
+        <w:drawing>
+          <wp:inline distT="0" distB="0" distL="0" distR="0" wp14:anchorId="10B2B6C2" wp14:editId="68920EB3">
+            <wp:extent cx="5612130" cy="1417320"/>
+            <wp:effectExtent l="0" t="0" r="7620" b="0"/>
+            <wp:docPr id="926855707" name="Imagen 7"/>
+            <wp:cNvGraphicFramePr>
+              <a:graphicFrameLocks xmlns:a="http://schemas.openxmlformats.org/drawingml/2006/main" noChangeAspect="1"/>
+            </wp:cNvGraphicFramePr>
+            <a:graphic xmlns:a="http://schemas.openxmlformats.org/drawingml/2006/main">
+              <a:graphicData uri="http://schemas.openxmlformats.org/drawingml/2006/picture">
+                <pic:pic xmlns:pic="http://schemas.openxmlformats.org/drawingml/2006/picture">
+                  <pic:nvPicPr>
+                    <pic:cNvPr id="926855707" name="Imagen 926855707"/>
+                    <pic:cNvPicPr/>
+                  </pic:nvPicPr>
+                  <pic:blipFill rotWithShape="1">
+                    <a:blip r:embed="rId9">
+                      <a:extLst>
+                        <a:ext uri="{28A0092B-C50C-407E-A947-70E740481C1C}">
+                          <a14:useLocalDpi xmlns:a14="http://schemas.microsoft.com/office/drawing/2010/main" val="0"/>
+                        </a:ext>
+                      </a:extLst>
+                    </a:blip>
+                    <a:srcRect b="36483"/>
+                    <a:stretch>
+                      <a:fillRect/>
+                    </a:stretch>
+                  </pic:blipFill>
+                  <pic:spPr bwMode="auto">
+                    <a:xfrm>
+                      <a:off x="0" y="0"/>
+                      <a:ext cx="5612130" cy="1417320"/>
+                    </a:xfrm>
+                    <a:prstGeom prst="rect">
+                      <a:avLst/>
+                    </a:prstGeom>
+                    <a:ln>
+                      <a:noFill/>
+                    </a:ln>
+                    <a:extLst>
+                      <a:ext uri="{53640926-AAD7-44D8-BBD7-CCE9431645EC}">
+                        <a14:shadowObscured xmlns:a14="http://schemas.microsoft.com/office/drawing/2010/main"/>
+                      </a:ext>
+                    </a:extLst>
+                  </pic:spPr>
+                </pic:pic>
+              </a:graphicData>
+            </a:graphic>
+          </wp:inline>
+        </w:drawing>
+      </w:r>
+    </w:p>
+    <w:p>
+      <w:pPr>
+        <w:spacing w:after="0"/>
+        <w:jc w:val="both"/>
+        <w:rPr>
+          <w:rFonts w:ascii="Arial" w:hAnsi="Arial" w:cs="Arial"/>
+          <w:sz w:val="16"/>
+          <w:szCs w:val="16"/>
+        </w:rPr>
+      </w:pPr>
+    </w:p>
+    <w:p>
+      <w:pPr>
+        <w:spacing w:after="0"/>
+        <w:jc w:val="both"/>
+        <w:rPr>
+          <w:rFonts w:ascii="Arial" w:hAnsi="Arial" w:cs="Arial"/>
+        </w:rPr>
+      </w:pPr>
+      <w:r>
+        <w:rPr>
+          <w:rFonts w:ascii="Arial" w:hAnsi="Arial" w:cs="Arial"/>
+          <w:noProof/>
+        </w:rPr>
+        <w:drawing>
+          <wp:inline distT="0" distB="0" distL="0" distR="0" wp14:anchorId="76BB22F7" wp14:editId="7B89E77F">
+            <wp:extent cx="5612130" cy="1325880"/>
+            <wp:effectExtent l="0" t="0" r="7620" b="7620"/>
+            <wp:docPr id="866805541" name="Imagen 8"/>
+            <wp:cNvGraphicFramePr>
+              <a:graphicFrameLocks xmlns:a="http://schemas.openxmlformats.org/drawingml/2006/main" noChangeAspect="1"/>
+            </wp:cNvGraphicFramePr>
+            <a:graphic xmlns:a="http://schemas.openxmlformats.org/drawingml/2006/main">
+              <a:graphicData uri="http://schemas.openxmlformats.org/drawingml/2006/picture">
+                <pic:pic xmlns:pic="http://schemas.openxmlformats.org/drawingml/2006/picture">
+                  <pic:nvPicPr>
+                    <pic:cNvPr id="866805541" name="Imagen 866805541"/>
+                    <pic:cNvPicPr/>
+                  </pic:nvPicPr>
+                  <pic:blipFill rotWithShape="1">
+                    <a:blip r:embed="rId10">
+                      <a:extLst>
+                        <a:ext uri="{28A0092B-C50C-407E-A947-70E740481C1C}">
+                          <a14:useLocalDpi xmlns:a14="http://schemas.microsoft.com/office/drawing/2010/main" val="0"/>
+                        </a:ext>
+                      </a:extLst>
+                    </a:blip>
+                    <a:srcRect b="27751"/>
+                    <a:stretch>
+                      <a:fillRect/>
+                    </a:stretch>
+                  </pic:blipFill>
+                  <pic:spPr bwMode="auto">
+                    <a:xfrm>
+                      <a:off x="0" y="0"/>
+                      <a:ext cx="5612130" cy="1325880"/>
+                    </a:xfrm>
+                    <a:prstGeom prst="rect">
+                      <a:avLst/>
+                    </a:prstGeom>
+                    <a:ln>
+                      <a:noFill/>
+                    </a:ln>
+                    <a:extLst>
+                      <a:ext uri="{53640926-AAD7-44D8-BBD7-CCE9431645EC}">
+                        <a14:shadowObscured xmlns:a14="http://schemas.microsoft.com/office/drawing/2010/main"/>
+                      </a:ext>
+                    </a:extLst>
+                  </pic:spPr>
+                </pic:pic>
+              </a:graphicData>
+            </a:graphic>
+          </wp:inline>
+        </w:drawing>
+      </w:r>
+    </w:p>
+    <w:p>
+      <w:pPr>
+        <w:spacing w:after="0"/>
+        <w:jc w:val="both"/>
+        <w:rPr>
+          <w:rFonts w:ascii="Arial" w:hAnsi="Arial" w:cs="Arial"/>
+          <w:sz w:val="16"/>
+          <w:szCs w:val="16"/>
+        </w:rPr>
+      </w:pPr>
+    </w:p>
+    <w:p>
+      <w:pPr>
+        <w:spacing w:after="0"/>
+        <w:jc w:val="both"/>
+        <w:rPr>
+          <w:rFonts w:ascii="Arial" w:hAnsi="Arial" w:cs="Arial"/>
+          <w:sz w:val="16"/>
+          <w:szCs w:val="16"/>
+        </w:rPr>
+      </w:pPr>
+    </w:p>
+    <w:p>
+      <w:pPr>
+        <w:spacing w:after="0"/>
+        <w:jc w:val="both"/>
+        <w:rPr>
+          <w:rFonts w:ascii="Arial" w:hAnsi="Arial" w:cs="Arial"/>
+          <w:sz w:val="16"/>
+          <w:szCs w:val="16"/>
+        </w:rPr>
+      </w:pPr>
+    </w:p>
+    <w:p>
+      <w:pPr>
+        <w:spacing w:after="0"/>
+        <w:jc w:val="both"/>
+        <w:rPr>
+          <w:rFonts w:ascii="Arial" w:hAnsi="Arial" w:cs="Arial"/>
+          <w:sz w:val="16"/>
+          <w:szCs w:val="16"/>
+        </w:rPr>
+      </w:pPr>
+    </w:p>
+    <w:p>
+      <w:pPr>
+        <w:spacing w:after="0"/>
+        <w:jc w:val="both"/>
+        <w:rPr>
+          <w:rFonts w:ascii="Arial" w:hAnsi="Arial" w:cs="Arial"/>
+          <w:sz w:val="16"/>
+          <w:szCs w:val="16"/>
+        </w:rPr>
+      </w:pPr>
+    </w:p>
+    <w:p>
+      <w:pPr>
+        <w:spacing w:after="0"/>
+        <w:jc w:val="both"/>
+        <w:rPr>
+          <w:rFonts w:ascii="Arial" w:hAnsi="Arial" w:cs="Arial"/>
+          <w:sz w:val="16"/>
+          <w:szCs w:val="16"/>
+        </w:rPr>
+      </w:pPr>
+    </w:p>
+    <w:p>
+      <w:pPr>
+        <w:spacing w:after="0"/>
+        <w:jc w:val="both"/>
+        <w:rPr>
+          <w:rFonts w:ascii="Arial" w:hAnsi="Arial" w:cs="Arial"/>
+          <w:b/>
+          <w:bCs/>
+          <w:sz w:val="28"/>
+          <w:szCs w:val="28"/>
+        </w:rPr>
+      </w:pPr>
+      <w:r>
+        <w:rPr>
+          <w:rFonts w:ascii="Arial" w:hAnsi="Arial" w:cs="Arial"/>
+          <w:b/>
+          <w:bCs/>
+          <w:sz w:val="28"/>
+          <w:szCs w:val="28"/>
+        </w:rPr>
+        <w:lastRenderedPageBreak/>
+        <w:t>Mejora 4 antes y después corregido</w:t>
+      </w:r>
+    </w:p>
+    <w:p>
+      <w:pPr>
+        <w:spacing w:after="0"/>
+        <w:jc w:val="both"/>
+        <w:rPr>
+          <w:rFonts w:ascii="Arial" w:hAnsi="Arial" w:cs="Arial"/>
+          <w:sz w:val="16"/>
+          <w:szCs w:val="16"/>
+        </w:rPr>
+      </w:pPr>
+    </w:p>
+    <w:p>
+      <w:pPr>
+        <w:spacing w:after="0"/>
+        <w:jc w:val="both"/>
+        <w:rPr>
+          <w:rFonts w:ascii="Arial" w:hAnsi="Arial" w:cs="Arial"/>
+        </w:rPr>
+      </w:pPr>
+      <w:r>
+        <w:rPr>
+          <w:rFonts w:ascii="Arial" w:hAnsi="Arial" w:cs="Arial"/>
+          <w:noProof/>
+        </w:rPr>
+        <w:drawing>
+          <wp:inline distT="0" distB="0" distL="0" distR="0" wp14:anchorId="5E60E0D7" wp14:editId="61086396">
+            <wp:extent cx="5612130" cy="1463040"/>
+            <wp:effectExtent l="0" t="0" r="7620" b="3810"/>
+            <wp:docPr id="424534823" name="Imagen 9"/>
+            <wp:cNvGraphicFramePr>
+              <a:graphicFrameLocks xmlns:a="http://schemas.openxmlformats.org/drawingml/2006/main" noChangeAspect="1"/>
+            </wp:cNvGraphicFramePr>
+            <a:graphic xmlns:a="http://schemas.openxmlformats.org/drawingml/2006/main">
+              <a:graphicData uri="http://schemas.openxmlformats.org/drawingml/2006/picture">
+                <pic:pic xmlns:pic="http://schemas.openxmlformats.org/drawingml/2006/picture">
+                  <pic:nvPicPr>
+                    <pic:cNvPr id="424534823" name="Imagen 424534823"/>
+                    <pic:cNvPicPr/>
+                  </pic:nvPicPr>
+                  <pic:blipFill rotWithShape="1">
+                    <a:blip r:embed="rId11">
+                      <a:extLst>
+                        <a:ext uri="{28A0092B-C50C-407E-A947-70E740481C1C}">
+                          <a14:useLocalDpi xmlns:a14="http://schemas.microsoft.com/office/drawing/2010/main" val="0"/>
+                        </a:ext>
+                      </a:extLst>
+                    </a:blip>
+                    <a:srcRect b="32711"/>
+                    <a:stretch>
+                      <a:fillRect/>
+                    </a:stretch>
+                  </pic:blipFill>
+                  <pic:spPr bwMode="auto">
+                    <a:xfrm>
+                      <a:off x="0" y="0"/>
+                      <a:ext cx="5612130" cy="1463040"/>
+                    </a:xfrm>
+                    <a:prstGeom prst="rect">
+                      <a:avLst/>
+                    </a:prstGeom>
+                    <a:ln>
+                      <a:noFill/>
+                    </a:ln>
+                    <a:extLst>
+                      <a:ext uri="{53640926-AAD7-44D8-BBD7-CCE9431645EC}">
+                        <a14:shadowObscured xmlns:a14="http://schemas.microsoft.com/office/drawing/2010/main"/>
+                      </a:ext>
+                    </a:extLst>
+                  </pic:spPr>
+                </pic:pic>
+              </a:graphicData>
+            </a:graphic>
+          </wp:inline>
+        </w:drawing>
+      </w:r>
+    </w:p>
+    <w:p>
+      <w:pPr>
+        <w:spacing w:after="0"/>
+        <w:jc w:val="both"/>
+        <w:rPr>
+          <w:rFonts w:ascii="Arial" w:hAnsi="Arial" w:cs="Arial"/>
+          <w:sz w:val="16"/>
+          <w:szCs w:val="16"/>
+        </w:rPr>
+      </w:pPr>
+    </w:p>
+    <w:p>
+      <w:pPr>
+        <w:spacing w:after="0"/>
+        <w:jc w:val="both"/>
+        <w:rPr>
+          <w:rFonts w:ascii="Arial" w:hAnsi="Arial" w:cs="Arial"/>
+        </w:rPr>
+      </w:pPr>
+      <w:r>
+        <w:rPr>
+          <w:rFonts w:ascii="Arial" w:hAnsi="Arial" w:cs="Arial"/>
+          <w:noProof/>
+        </w:rPr>
+        <w:drawing>
+          <wp:inline distT="0" distB="0" distL="0" distR="0" wp14:anchorId="19DBDEDF" wp14:editId="746CBE07">
+            <wp:extent cx="5612130" cy="1181100"/>
+            <wp:effectExtent l="0" t="0" r="7620" b="0"/>
+            <wp:docPr id="282740353" name="Imagen 10"/>
+            <wp:cNvGraphicFramePr>
+              <a:graphicFrameLocks xmlns:a="http://schemas.openxmlformats.org/drawingml/2006/main" noChangeAspect="1"/>
+            </wp:cNvGraphicFramePr>
+            <a:graphic xmlns:a="http://schemas.openxmlformats.org/drawingml/2006/main">
+              <a:graphicData uri="http://schemas.openxmlformats.org/drawingml/2006/picture">
+                <pic:pic xmlns:pic="http://schemas.openxmlformats.org/drawingml/2006/picture">
+                  <pic:nvPicPr>
+                    <pic:cNvPr id="282740353" name="Imagen 282740353"/>
+                    <pic:cNvPicPr/>
+                  </pic:nvPicPr>
+                  <pic:blipFill rotWithShape="1">
+                    <a:blip r:embed="rId12">
+                      <a:extLst>
+                        <a:ext uri="{28A0092B-C50C-407E-A947-70E740481C1C}">
+                          <a14:useLocalDpi xmlns:a14="http://schemas.microsoft.com/office/drawing/2010/main" val="0"/>
+                        </a:ext>
+                      </a:extLst>
+                    </a:blip>
+                    <a:srcRect b="40613"/>
+                    <a:stretch>
+                      <a:fillRect/>
+                    </a:stretch>
+                  </pic:blipFill>
+                  <pic:spPr bwMode="auto">
+                    <a:xfrm>
+                      <a:off x="0" y="0"/>
+                      <a:ext cx="5612130" cy="1181100"/>
+                    </a:xfrm>
+                    <a:prstGeom prst="rect">
+                      <a:avLst/>
+                    </a:prstGeom>
+                    <a:ln>
+                      <a:noFill/>
+                    </a:ln>
+                    <a:extLst>
+                      <a:ext uri="{53640926-AAD7-44D8-BBD7-CCE9431645EC}">
+                        <a14:shadowObscured xmlns:a14="http://schemas.microsoft.com/office/drawing/2010/main"/>
+                      </a:ext>
+                    </a:extLst>
+                  </pic:spPr>
+                </pic:pic>
+              </a:graphicData>
+            </a:graphic>
+          </wp:inline>
+        </w:drawing>
+      </w:r>
+    </w:p>
+    <w:p>
+      <w:pPr>
+        <w:spacing w:after="0"/>
+        <w:jc w:val="both"/>
+        <w:rPr>
+          <w:rFonts w:ascii="Arial" w:hAnsi="Arial" w:cs="Arial"/>
+          <w:sz w:val="16"/>
+          <w:szCs w:val="16"/>
+        </w:rPr>
+      </w:pPr>
+    </w:p>
+    <w:p>
+      <w:pPr>
+        <w:spacing w:after="0"/>
+        <w:jc w:val="both"/>
+        <w:rPr>
+          <w:rFonts w:ascii="Arial" w:hAnsi="Arial" w:cs="Arial"/>
+          <w:sz w:val="16"/>
+          <w:szCs w:val="16"/>
+        </w:rPr>
+      </w:pPr>
+    </w:p>
+    <w:p>
+      <w:pPr>
+        <w:spacing w:after="0"/>
+        <w:jc w:val="both"/>
+        <w:rPr>
+          <w:rFonts w:ascii="Arial" w:hAnsi="Arial" w:cs="Arial"/>
+          <w:sz w:val="16"/>
+          <w:szCs w:val="16"/>
+        </w:rPr>
+      </w:pPr>
+    </w:p>
+    <w:p>
+      <w:pPr>
+        <w:spacing w:after="0"/>
+        <w:jc w:val="both"/>
+        <w:rPr>
+          <w:rFonts w:ascii="Arial" w:hAnsi="Arial" w:cs="Arial"/>
+          <w:b/>
+          <w:bCs/>
+          <w:sz w:val="28"/>
+          <w:szCs w:val="28"/>
+        </w:rPr>
+      </w:pPr>
+      <w:r>
+        <w:rPr>
+          <w:rFonts w:ascii="Arial" w:hAnsi="Arial" w:cs="Arial"/>
+          <w:b/>
+          <w:bCs/>
+          <w:sz w:val="28"/>
+          <w:szCs w:val="28"/>
+        </w:rPr>
+        <w:t>Mejora 5 antes y después corregido</w:t>
+      </w:r>
+    </w:p>
+    <w:p>
+      <w:pPr>
+        <w:spacing w:after="0"/>
+        <w:jc w:val="both"/>
+        <w:rPr>
+          <w:rFonts w:ascii="Arial" w:hAnsi="Arial" w:cs="Arial"/>
+          <w:sz w:val="16"/>
+          <w:szCs w:val="16"/>
+        </w:rPr>
+      </w:pPr>
+    </w:p>
+    <w:p>
+      <w:pPr>
+        <w:spacing w:after="0"/>
+        <w:jc w:val="both"/>
+        <w:rPr>
+          <w:rFonts w:ascii="Arial" w:hAnsi="Arial" w:cs="Arial"/>
+        </w:rPr>
+      </w:pPr>
+      <w:r>
+        <w:rPr>
+          <w:rFonts w:ascii="Arial" w:hAnsi="Arial" w:cs="Arial"/>
+          <w:noProof/>
+        </w:rPr>
+        <w:drawing>
+          <wp:inline distT="0" distB="0" distL="0" distR="0" wp14:anchorId="55F04FF2" wp14:editId="0F19D63F">
+            <wp:extent cx="5612130" cy="1287780"/>
+            <wp:effectExtent l="0" t="0" r="7620" b="7620"/>
+            <wp:docPr id="1199861819" name="Imagen 11"/>
+            <wp:cNvGraphicFramePr>
+              <a:graphicFrameLocks xmlns:a="http://schemas.openxmlformats.org/drawingml/2006/main" noChangeAspect="1"/>
+            </wp:cNvGraphicFramePr>
+            <a:graphic xmlns:a="http://schemas.openxmlformats.org/drawingml/2006/main">
+              <a:graphicData uri="http://schemas.openxmlformats.org/drawingml/2006/picture">
+                <pic:pic xmlns:pic="http://schemas.openxmlformats.org/drawingml/2006/picture">
+                  <pic:nvPicPr>
+                    <pic:cNvPr id="1199861819" name="Imagen 1199861819"/>
+                    <pic:cNvPicPr/>
+                  </pic:nvPicPr>
+                  <pic:blipFill rotWithShape="1">
+                    <a:blip r:embed="rId13">
+                      <a:extLst>
+                        <a:ext uri="{28A0092B-C50C-407E-A947-70E740481C1C}">
+                          <a14:useLocalDpi xmlns:a14="http://schemas.microsoft.com/office/drawing/2010/main" val="0"/>
+                        </a:ext>
+                      </a:extLst>
+                    </a:blip>
+                    <a:srcRect b="33552"/>
+                    <a:stretch>
+                      <a:fillRect/>
+                    </a:stretch>
+                  </pic:blipFill>
+                  <pic:spPr bwMode="auto">
+                    <a:xfrm>
+                      <a:off x="0" y="0"/>
+                      <a:ext cx="5612130" cy="1287780"/>
+                    </a:xfrm>
+                    <a:prstGeom prst="rect">
+                      <a:avLst/>
+                    </a:prstGeom>
+                    <a:ln>
+                      <a:noFill/>
+                    </a:ln>
+                    <a:extLst>
+                      <a:ext uri="{53640926-AAD7-44D8-BBD7-CCE9431645EC}">
+                        <a14:shadowObscured xmlns:a14="http://schemas.microsoft.com/office/drawing/2010/main"/>
+                      </a:ext>
+                    </a:extLst>
+                  </pic:spPr>
+                </pic:pic>
+              </a:graphicData>
+            </a:graphic>
+          </wp:inline>
+        </w:drawing>
+      </w:r>
+    </w:p>
+    <w:p>
+      <w:pPr>
+        <w:spacing w:after="0"/>
+        <w:jc w:val="both"/>
+        <w:rPr>
+          <w:rFonts w:ascii="Arial" w:hAnsi="Arial" w:cs="Arial"/>
+        </w:rPr>
+      </w:pPr>
+    </w:p>
+    <w:p>
+      <w:pPr>
+        <w:jc w:val="both"/>
+        <w:rPr>
+          <w:rFonts w:ascii="Arial" w:hAnsi="Arial" w:cs="Arial"/>
+        </w:rPr>
+      </w:pPr>
+      <w:r>
+        <w:rPr>
+          <w:rFonts w:ascii="Arial" w:hAnsi="Arial" w:cs="Arial"/>
+          <w:noProof/>
+        </w:rPr>
+        <w:drawing>
+          <wp:inline distT="0" distB="0" distL="0" distR="0" wp14:anchorId="38E1BC85" wp14:editId="7C5496AA">
+            <wp:extent cx="5612130" cy="1426845"/>
+            <wp:effectExtent l="0" t="0" r="7620" b="1905"/>
+            <wp:docPr id="777125796" name="Imagen 12"/>
+            <wp:cNvGraphicFramePr>
+              <a:graphicFrameLocks xmlns:a="http://schemas.openxmlformats.org/drawingml/2006/main" noChangeAspect="1"/>
+            </wp:cNvGraphicFramePr>
+            <a:graphic xmlns:a="http://schemas.openxmlformats.org/drawingml/2006/main">
+              <a:graphicData uri="http://schemas.openxmlformats.org/drawingml/2006/picture">
+                <pic:pic xmlns:pic="http://schemas.openxmlformats.org/drawingml/2006/picture">
+                  <pic:nvPicPr>
+                    <pic:cNvPr id="777125796" name="Imagen 777125796"/>
+                    <pic:cNvPicPr/>
+                  </pic:nvPicPr>
+                  <pic:blipFill>
+                    <a:blip r:embed="rId14">
+                      <a:extLst>
+                        <a:ext uri="{28A0092B-C50C-407E-A947-70E740481C1C}">
+                          <a14:useLocalDpi xmlns:a14="http://schemas.microsoft.com/office/drawing/2010/main" val="0"/>
+                        </a:ext>
+                      </a:extLst>
+                    </a:blip>
+                    <a:stretch>
+                      <a:fillRect/>
+                    </a:stretch>
+                  </pic:blipFill>
+                  <pic:spPr>
+                    <a:xfrm>
+                      <a:off x="0" y="0"/>
+                      <a:ext cx="5612130" cy="1426845"/>
+                    </a:xfrm>
+                    <a:prstGeom prst="rect">
+                      <a:avLst/>
+                    </a:prstGeom>
+                  </pic:spPr>
+                </pic:pic>
+              </a:graphicData>
+            </a:graphic>
+          </wp:inline>
+        </w:drawing>
+      </w:r>
     </w:p>
     <w:sectPr>
       <w:pgSz w:w="12240" w:h="15840"/>
@@ -3460,6 +4359,7 @@
   <w:style w:type="character" w:default="1" w:styleId="Fuentedeprrafopredeter">
     <w:name w:val="Default Paragraph Font"/>
     <w:uiPriority w:val="1"/>
+    <w:semiHidden/>
     <w:unhideWhenUsed/>
   </w:style>
   <w:style w:type="table" w:default="1" w:styleId="Tablanormal">

</xml_diff>